<commit_message>
Add geometric fidelity requirement to Option D requirements doc
Clarifies that OPTION_D must be built by scaling the real ASSEMBLY_pan_tilt.STEP
geometry per part, not rebuilt from generic primitives, so the design actually
looks like the original rather than just matching its function.

Co-Authored-By: Claude Sonnet 5 <noreply@anthropic.com>
</commit_message>
<xml_diff>
--- a/Requirements_design_pan_tilt_D.docx
+++ b/Requirements_design_pan_tilt_D.docx
@@ -350,6 +350,99 @@
       </w:r>
       <w:r>
         <w:t xml:space="preserve"> will be using plane and understandable  language ( I am not mechanical  engineer )</w:t>
+      </w:r>
+    </w:p>
+    <w:p>
+      <w:r>
+        <w:rPr>
+          <w:b/>
+          <w:u w:val="single"/>
+        </w:rPr>
+        <w:t>GEOMETRIC FIDELITY REQUIREMENT (added 2026-08-15) :</w:t>
+      </w:r>
+    </w:p>
+    <w:p>
+      <w:pPr>
+        <w:pStyle w:val="Prrafodelista"/>
+        <w:numPr>
+          <w:ilvl w:val="0"/>
+          <w:numId w:val="1"/>
+        </w:numPr>
+      </w:pPr>
+      <w:r>
+        <w:t>The new design must be built by taking the real 3D shape of each piece from ASSEMBLY_pan_tilt.STEP and scaling it down (~1/3), not by re-drawing pieces from simple shapes (cylinders, boxes) that only approximate the original's size. The goal is that OPTION_D actually looks like the original design, not just that it does the same job.</w:t>
+      </w:r>
+    </w:p>
+    <w:p>
+      <w:pPr>
+        <w:pStyle w:val="Prrafodelista"/>
+        <w:numPr>
+          <w:ilvl w:val="0"/>
+          <w:numId w:val="1"/>
+        </w:numPr>
+      </w:pPr>
+      <w:r>
+        <w:t>Only the following parts are allowed to have a genuinely different shape from the scaled original, because these changes were already discussed and agreed:</w:t>
+      </w:r>
+    </w:p>
+    <w:p>
+      <w:pPr>
+        <w:pStyle w:val="Prrafodelista"/>
+        <w:numPr>
+          <w:ilvl w:val="0"/>
+          <w:numId w:val="1"/>
+        </w:numPr>
+      </w:pPr>
+      <w:r>
+        <w:t xml:space="preserve">   - The two motors: replaced by the real shape of the 28BYJ48 motor (instead of the original's generic motor shape).</w:t>
+      </w:r>
+    </w:p>
+    <w:p>
+      <w:pPr>
+        <w:pStyle w:val="Prrafodelista"/>
+        <w:numPr>
+          <w:ilvl w:val="0"/>
+          <w:numId w:val="1"/>
+        </w:numPr>
+      </w:pPr>
+      <w:r>
+        <w:t xml:space="preserve">   - A few bearings: replaced by real, off-the-shelf bearings that can actually be bought (the original's bearings do not exist that small).</w:t>
+      </w:r>
+    </w:p>
+    <w:p>
+      <w:pPr>
+        <w:pStyle w:val="Prrafodelista"/>
+        <w:numPr>
+          <w:ilvl w:val="0"/>
+          <w:numId w:val="1"/>
+        </w:numPr>
+      </w:pPr>
+      <w:r>
+        <w:t xml:space="preserve">   - The gear teeth: same tooth count and ratio as the original, but resized so they are strong enough to 3D print (an exact 1/3-size tooth would be too thin to print or use).</w:t>
+      </w:r>
+    </w:p>
+    <w:p>
+      <w:pPr>
+        <w:pStyle w:val="Prrafodelista"/>
+        <w:numPr>
+          <w:ilvl w:val="0"/>
+          <w:numId w:val="1"/>
+        </w:numPr>
+      </w:pPr>
+      <w:r>
+        <w:t>Every other piece (the housing/base, the motor-mounting brackets, the fork-shaped “Cam Holder” bracket, the shafts, the spacers, etc.) must keep the real scaled-down shape of the original piece. Only the small area that must change to fit the new motor or bearing (for example, a bolt hole or a bearing seat) may be modified — the rest of that piece's shape must stay as in the original, just smaller.</w:t>
+      </w:r>
+    </w:p>
+    <w:p>
+      <w:pPr>
+        <w:pStyle w:val="Prrafodelista"/>
+        <w:numPr>
+          <w:ilvl w:val="0"/>
+          <w:numId w:val="1"/>
+        </w:numPr>
+      </w:pPr>
+      <w:r>
+        <w:t>The “Cam Holder” bracket also keeps its real original shape, just built as a fixed/rigid piece (no moving third pivot), as already agreed.</w:t>
       </w:r>
     </w:p>
     <w:sectPr>

</xml_diff>